<commit_message>
Atualizando Documentação de acordo com as orientações do professor
</commit_message>
<xml_diff>
--- a/Documentaçao/Requisitos_parte_2.docx
+++ b/Documentaçao/Requisitos_parte_2.docx
@@ -1,1288 +1,12 @@
 
 <file path=word/document.xml><?xml version="1.0" encoding="utf-8"?>
-<w:document xmlns:wpc="http://schemas.microsoft.com/office/word/2010/wordprocessingCanvas" xmlns:cx="http://schemas.microsoft.com/office/drawing/2014/chartex" xmlns:cx1="http://schemas.microsoft.com/office/drawing/2015/9/8/chartex" xmlns:cx2="http://schemas.microsoft.com/office/drawing/2015/10/21/chartex" xmlns:cx3="http://schemas.microsoft.com/office/drawing/2016/5/9/chartex" xmlns:cx4="http://schemas.microsoft.com/office/drawing/2016/5/10/chartex" xmlns:cx5="http://schemas.microsoft.com/office/drawing/2016/5/11/chartex" xmlns:cx6="http://schemas.microsoft.com/office/drawing/2016/5/12/chartex" xmlns:cx7="http://schemas.microsoft.com/office/drawing/2016/5/13/chartex" xmlns:cx8="http://schemas.microsoft.com/office/drawing/2016/5/14/chartex" xmlns:mc="http://schemas.openxmlformats.org/markup-compatibility/2006" xmlns:aink="http://schemas.microsoft.com/office/drawing/2016/ink" xmlns:am3d="http://schemas.microsoft.com/office/drawing/2017/model3d" xmlns:o="urn:schemas-microsoft-com:office:office" xmlns:oel="http://schemas.microsoft.com/office/2019/extlst" xmlns:r="http://schemas.openxmlformats.org/officeDocument/2006/relationships" xmlns:m="http://schemas.openxmlformats.org/officeDocument/2006/math" xmlns:v="urn:schemas-microsoft-com:vml" xmlns:wp14="http://schemas.microsoft.com/office/word/2010/wordprocessingDrawing" xmlns:wp="http://schemas.openxmlformats.org/drawingml/2006/wordprocessingDrawing" xmlns:w10="urn:schemas-microsoft-com:office:word" xmlns:w="http://schemas.openxmlformats.org/wordprocessingml/2006/main" xmlns:w14="http://schemas.microsoft.com/office/word/2010/wordml" xmlns:w15="http://schemas.microsoft.com/office/word/2012/wordml" xmlns:w16cex="http://schemas.microsoft.com/office/word/2018/wordml/cex" xmlns:w16cid="http://schemas.microsoft.com/office/word/2016/wordml/cid" xmlns:w16="http://schemas.microsoft.com/office/word/2018/wordml" xmlns:w16du="http://schemas.microsoft.com/office/word/2023/wordml/word16du" xmlns:w16sdtdh="http://schemas.microsoft.com/office/word/2020/wordml/sdtdatahash" xmlns:w16sdtfl="http://schemas.microsoft.com/office/word/2024/wordml/sdtformatlock" xmlns:w16se="http://schemas.microsoft.com/office/word/2015/wordml/symex" xmlns:wpg="http://schemas.microsoft.com/office/word/2010/wordprocessingGroup" xmlns:wpi="http://schemas.microsoft.com/office/word/2010/wordprocessingInk" xmlns:wne="http://schemas.microsoft.com/office/word/2006/wordml" xmlns:wps="http://schemas.microsoft.com/office/word/2010/wordprocessingShape" mc:Ignorable="w14 w15 w16se w16cid w16 w16cex w16sdtdh w16sdtfl w16du wp14">
+<w:document xmlns:wpc="http://schemas.microsoft.com/office/word/2010/wordprocessingCanvas" xmlns:cx="http://schemas.microsoft.com/office/drawing/2014/chartex" xmlns:cx1="http://schemas.microsoft.com/office/drawing/2015/9/8/chartex" xmlns:cx2="http://schemas.microsoft.com/office/drawing/2015/10/21/chartex" xmlns:cx3="http://schemas.microsoft.com/office/drawing/2016/5/9/chartex" xmlns:cx4="http://schemas.microsoft.com/office/drawing/2016/5/10/chartex" xmlns:cx5="http://schemas.microsoft.com/office/drawing/2016/5/11/chartex" xmlns:cx6="http://schemas.microsoft.com/office/drawing/2016/5/12/chartex" xmlns:cx7="http://schemas.microsoft.com/office/drawing/2016/5/13/chartex" xmlns:cx8="http://schemas.microsoft.com/office/drawing/2016/5/14/chartex" xmlns:mc="http://schemas.openxmlformats.org/markup-compatibility/2006" xmlns:aink="http://schemas.microsoft.com/office/drawing/2016/ink" xmlns:am3d="http://schemas.microsoft.com/office/drawing/2017/model3d" xmlns:o="urn:schemas-microsoft-com:office:office" xmlns:oel="http://schemas.microsoft.com/office/2019/extlst" xmlns:r="http://schemas.openxmlformats.org/officeDocument/2006/relationships" xmlns:m="http://schemas.openxmlformats.org/officeDocument/2006/math" xmlns:v="urn:schemas-microsoft-com:vml" xmlns:wp14="http://schemas.microsoft.com/office/word/2010/wordprocessingDrawing" xmlns:wp="http://schemas.openxmlformats.org/drawingml/2006/wordprocessingDrawing" xmlns:w10="urn:schemas-microsoft-com:office:word" xmlns:w="http://schemas.openxmlformats.org/wordprocessingml/2006/main" xmlns:w14="http://schemas.microsoft.com/office/word/2010/wordml" xmlns:w15="http://schemas.microsoft.com/office/word/2012/wordml" xmlns:w16cex="http://schemas.microsoft.com/office/word/2018/wordml/cex" xmlns:w16cid="http://schemas.microsoft.com/office/word/2016/wordml/cid" xmlns:w16="http://schemas.microsoft.com/office/word/2018/wordml" xmlns:w16sdtdh="http://schemas.microsoft.com/office/word/2020/wordml/sdtdatahash" xmlns:w16se="http://schemas.microsoft.com/office/word/2015/wordml/symex" xmlns:wpg="http://schemas.microsoft.com/office/word/2010/wordprocessingGroup" xmlns:wpi="http://schemas.microsoft.com/office/word/2010/wordprocessingInk" xmlns:wne="http://schemas.microsoft.com/office/word/2006/wordml" xmlns:wps="http://schemas.microsoft.com/office/word/2010/wordprocessingShape" mc:Ignorable="w14 w15 w16se w16cid w16 w16cex w16sdtdh wp14">
   <w:body>
     <w:p>
       <w:r>
-        <w:t xml:space="preserve">Requisitos mais refinados </w:t>
+        <w:t>SGBD</w:t>
       </w:r>
     </w:p>
-    <w:p/>
-    <w:tbl>
-      <w:tblPr>
-        <w:tblStyle w:val="Tabelacomgrade"/>
-        <w:tblW w:w="10632" w:type="dxa"/>
-        <w:tblInd w:w="-998" w:type="dxa"/>
-        <w:tblLook w:val="04A0" w:firstRow="1" w:lastRow="0" w:firstColumn="1" w:lastColumn="0" w:noHBand="0" w:noVBand="1"/>
-      </w:tblPr>
-      <w:tblGrid>
-        <w:gridCol w:w="851"/>
-        <w:gridCol w:w="2127"/>
-        <w:gridCol w:w="7654"/>
-      </w:tblGrid>
-      <w:tr>
-        <w:trPr>
-          <w:trHeight w:val="553"/>
-        </w:trPr>
-        <w:tc>
-          <w:tcPr>
-            <w:tcW w:w="851" w:type="dxa"/>
-          </w:tcPr>
-          <w:p>
-            <w:pPr>
-              <w:rPr>
-                <w:sz w:val="20"/>
-                <w:szCs w:val="20"/>
-              </w:rPr>
-            </w:pPr>
-            <w:r>
-              <w:rPr>
-                <w:sz w:val="20"/>
-                <w:szCs w:val="20"/>
-              </w:rPr>
-              <w:t xml:space="preserve">     ID</w:t>
-            </w:r>
-          </w:p>
-        </w:tc>
-        <w:tc>
-          <w:tcPr>
-            <w:tcW w:w="2127" w:type="dxa"/>
-          </w:tcPr>
-          <w:p>
-            <w:pPr>
-              <w:rPr>
-                <w:sz w:val="20"/>
-                <w:szCs w:val="20"/>
-              </w:rPr>
-            </w:pPr>
-            <w:r>
-              <w:rPr>
-                <w:sz w:val="20"/>
-                <w:szCs w:val="20"/>
-              </w:rPr>
-              <w:t xml:space="preserve">     Nome</w:t>
-            </w:r>
-          </w:p>
-        </w:tc>
-        <w:tc>
-          <w:tcPr>
-            <w:tcW w:w="7654" w:type="dxa"/>
-          </w:tcPr>
-          <w:p>
-            <w:pPr>
-              <w:rPr>
-                <w:sz w:val="20"/>
-                <w:szCs w:val="20"/>
-              </w:rPr>
-            </w:pPr>
-            <w:r>
-              <w:rPr>
-                <w:sz w:val="20"/>
-                <w:szCs w:val="20"/>
-              </w:rPr>
-              <w:t>Descrição Técnica</w:t>
-            </w:r>
-          </w:p>
-        </w:tc>
-      </w:tr>
-      <w:tr>
-        <w:trPr>
-          <w:trHeight w:val="575"/>
-        </w:trPr>
-        <w:tc>
-          <w:tcPr>
-            <w:tcW w:w="851" w:type="dxa"/>
-          </w:tcPr>
-          <w:p>
-            <w:r>
-              <w:t>RF01</w:t>
-            </w:r>
-          </w:p>
-        </w:tc>
-        <w:tc>
-          <w:tcPr>
-            <w:tcW w:w="2127" w:type="dxa"/>
-          </w:tcPr>
-          <w:p>
-            <w:pPr>
-              <w:rPr>
-                <w:sz w:val="20"/>
-                <w:szCs w:val="20"/>
-              </w:rPr>
-            </w:pPr>
-            <w:r>
-              <w:rPr>
-                <w:sz w:val="20"/>
-                <w:szCs w:val="20"/>
-              </w:rPr>
-              <w:t>Gestão de cadastro de usuários</w:t>
-            </w:r>
-          </w:p>
-        </w:tc>
-        <w:tc>
-          <w:tcPr>
-            <w:tcW w:w="7654" w:type="dxa"/>
-          </w:tcPr>
-          <w:p>
-            <w:pPr>
-              <w:rPr>
-                <w:sz w:val="20"/>
-                <w:szCs w:val="20"/>
-              </w:rPr>
-            </w:pPr>
-            <w:r>
-              <w:rPr>
-                <w:sz w:val="20"/>
-                <w:szCs w:val="20"/>
-              </w:rPr>
-              <w:t xml:space="preserve">O sistema permite que usuários com perfil </w:t>
-            </w:r>
-            <w:r>
-              <w:rPr>
-                <w:b/>
-                <w:bCs/>
-                <w:sz w:val="20"/>
-                <w:szCs w:val="20"/>
-              </w:rPr>
-              <w:t>Gestor</w:t>
-            </w:r>
-            <w:r>
-              <w:rPr>
-                <w:sz w:val="20"/>
-                <w:szCs w:val="20"/>
-              </w:rPr>
-              <w:t xml:space="preserve"> cadastrem colaboradores com os atributos: nome completo, CPF, e-mail, senha inicial, idade, telefone, endereço e perfil de acesso (Atendente ou Gestor). Os dados são validados no servidor (dígitos verificadores do CPF, formato do e-mail e política de senha do RNF03). CPF e e-mail têm restrição de unicidade na base. Em caso de duplicidade, a transação é abortada, nenhum registro é persistido, o sistema exibe mensagem de erro e redireciona para a tela de login. Em caso de sucesso, o sistema cria a credencial de acesso e armazena a senha apenas como </w:t>
-            </w:r>
-            <w:proofErr w:type="spellStart"/>
-            <w:r>
-              <w:rPr>
-                <w:sz w:val="20"/>
-                <w:szCs w:val="20"/>
-              </w:rPr>
-              <w:t>hash</w:t>
-            </w:r>
-            <w:proofErr w:type="spellEnd"/>
-            <w:r>
-              <w:rPr>
-                <w:sz w:val="20"/>
-                <w:szCs w:val="20"/>
-              </w:rPr>
-              <w:t>.</w:t>
-            </w:r>
-          </w:p>
-        </w:tc>
-      </w:tr>
-      <w:tr>
-        <w:trPr>
-          <w:trHeight w:val="556"/>
-        </w:trPr>
-        <w:tc>
-          <w:tcPr>
-            <w:tcW w:w="851" w:type="dxa"/>
-          </w:tcPr>
-          <w:p>
-            <w:r>
-              <w:t>RF02</w:t>
-            </w:r>
-          </w:p>
-        </w:tc>
-        <w:tc>
-          <w:tcPr>
-            <w:tcW w:w="2127" w:type="dxa"/>
-          </w:tcPr>
-          <w:p>
-            <w:pPr>
-              <w:rPr>
-                <w:sz w:val="20"/>
-                <w:szCs w:val="20"/>
-              </w:rPr>
-            </w:pPr>
-            <w:r>
-              <w:rPr>
-                <w:sz w:val="20"/>
-                <w:szCs w:val="20"/>
-              </w:rPr>
-              <w:t>Autenticação e controle de acesso</w:t>
-            </w:r>
-          </w:p>
-        </w:tc>
-        <w:tc>
-          <w:tcPr>
-            <w:tcW w:w="7654" w:type="dxa"/>
-          </w:tcPr>
-          <w:p>
-            <w:pPr>
-              <w:rPr>
-                <w:sz w:val="20"/>
-                <w:szCs w:val="20"/>
-              </w:rPr>
-            </w:pPr>
-            <w:r>
-              <w:rPr>
-                <w:sz w:val="20"/>
-                <w:szCs w:val="20"/>
-              </w:rPr>
-              <w:t xml:space="preserve">O sistema </w:t>
-            </w:r>
-            <w:r>
-              <w:rPr>
-                <w:sz w:val="20"/>
-                <w:szCs w:val="20"/>
-              </w:rPr>
-              <w:t>autêntica</w:t>
-            </w:r>
-            <w:r>
-              <w:rPr>
-                <w:sz w:val="20"/>
-                <w:szCs w:val="20"/>
-              </w:rPr>
-              <w:t xml:space="preserve"> por e-mail e senha, comparando o </w:t>
-            </w:r>
-            <w:proofErr w:type="spellStart"/>
-            <w:r>
-              <w:rPr>
-                <w:sz w:val="20"/>
-                <w:szCs w:val="20"/>
-              </w:rPr>
-              <w:t>hash</w:t>
-            </w:r>
-            <w:proofErr w:type="spellEnd"/>
-            <w:r>
-              <w:rPr>
-                <w:sz w:val="20"/>
-                <w:szCs w:val="20"/>
-              </w:rPr>
-              <w:t xml:space="preserve"> armazenado. Cada falha incrementa um contador de tentativas consecutivas por conta. Na 5ª falha, a conta passa ao estado </w:t>
-            </w:r>
-            <w:r>
-              <w:rPr>
-                <w:b/>
-                <w:bCs/>
-                <w:sz w:val="20"/>
-                <w:szCs w:val="20"/>
-              </w:rPr>
-              <w:t>bloqueada</w:t>
-            </w:r>
-            <w:r>
-              <w:rPr>
-                <w:sz w:val="20"/>
-                <w:szCs w:val="20"/>
-              </w:rPr>
-              <w:t>, novos logins são rejeitados e o sistema exibe a opção de redefinição de senha, feita por link com token de uso único e prazo de expiração. O login bem-sucedido zera o contador e abre uma sessão autenticada que carrega o perfil do usuário. O acesso a recursos restritos (RF01 e RF09) é autorizado por perfil.</w:t>
-            </w:r>
-          </w:p>
-        </w:tc>
-      </w:tr>
-      <w:tr>
-        <w:trPr>
-          <w:trHeight w:val="556"/>
-        </w:trPr>
-        <w:tc>
-          <w:tcPr>
-            <w:tcW w:w="851" w:type="dxa"/>
-          </w:tcPr>
-          <w:p>
-            <w:r>
-              <w:t>RF03</w:t>
-            </w:r>
-          </w:p>
-        </w:tc>
-        <w:tc>
-          <w:tcPr>
-            <w:tcW w:w="2127" w:type="dxa"/>
-          </w:tcPr>
-          <w:p>
-            <w:pPr>
-              <w:rPr>
-                <w:sz w:val="20"/>
-                <w:szCs w:val="20"/>
-              </w:rPr>
-            </w:pPr>
-            <w:r>
-              <w:rPr>
-                <w:sz w:val="20"/>
-                <w:szCs w:val="20"/>
-              </w:rPr>
-              <w:t>Cadastro de clientes</w:t>
-            </w:r>
-          </w:p>
-        </w:tc>
-        <w:tc>
-          <w:tcPr>
-            <w:tcW w:w="7654" w:type="dxa"/>
-          </w:tcPr>
-          <w:p>
-            <w:pPr>
-              <w:rPr>
-                <w:sz w:val="20"/>
-                <w:szCs w:val="20"/>
-              </w:rPr>
-            </w:pPr>
-            <w:r>
-              <w:rPr>
-                <w:sz w:val="20"/>
-                <w:szCs w:val="20"/>
-              </w:rPr>
-              <w:t>O sistema persiste clientes com nome, CPF, e-mail, telefone, endereço e canal de comunicação (WhatsApp, Instagram ou TikTok). O CPF é validado e tem restrição de unicidade. Se o CPF já existir, o sistema retorna erro de validação, interrompe a transação e mantém o formulário preenchido para correção. Em caso de sucesso, o registro fica disponível para consulta e o sistema emite confirmação.</w:t>
-            </w:r>
-          </w:p>
-        </w:tc>
-      </w:tr>
-      <w:tr>
-        <w:trPr>
-          <w:trHeight w:val="556"/>
-        </w:trPr>
-        <w:tc>
-          <w:tcPr>
-            <w:tcW w:w="851" w:type="dxa"/>
-          </w:tcPr>
-          <w:p>
-            <w:r>
-              <w:t>RF04</w:t>
-            </w:r>
-          </w:p>
-        </w:tc>
-        <w:tc>
-          <w:tcPr>
-            <w:tcW w:w="2127" w:type="dxa"/>
-          </w:tcPr>
-          <w:p>
-            <w:pPr>
-              <w:rPr>
-                <w:sz w:val="20"/>
-                <w:szCs w:val="20"/>
-              </w:rPr>
-            </w:pPr>
-            <w:r>
-              <w:rPr>
-                <w:sz w:val="20"/>
-                <w:szCs w:val="20"/>
-              </w:rPr>
-              <w:t>Consulta de clientes</w:t>
-            </w:r>
-          </w:p>
-        </w:tc>
-        <w:tc>
-          <w:tcPr>
-            <w:tcW w:w="7654" w:type="dxa"/>
-          </w:tcPr>
-          <w:p>
-            <w:pPr>
-              <w:rPr>
-                <w:sz w:val="20"/>
-                <w:szCs w:val="20"/>
-              </w:rPr>
-            </w:pPr>
-            <w:r>
-              <w:rPr>
-                <w:sz w:val="20"/>
-                <w:szCs w:val="20"/>
-              </w:rPr>
-              <w:t>O sistema permite pesquisar clientes por um ou mais filtros combinados: nome (busca parcial, sem distinção de maiúsculas/minúsculas), CPF e destino de viagem desejado. A consulta executa sobre campos indexados e retorna a listagem paginada. Ao selecionar um cliente, o sistema exibe o perfil completo e o histórico de atendimento. Sem resultados, o sistema exibe “Nenhum cliente atende aos critérios de pesquisa informados”.</w:t>
-            </w:r>
-          </w:p>
-        </w:tc>
-      </w:tr>
-      <w:tr>
-        <w:trPr>
-          <w:trHeight w:val="575"/>
-        </w:trPr>
-        <w:tc>
-          <w:tcPr>
-            <w:tcW w:w="851" w:type="dxa"/>
-          </w:tcPr>
-          <w:p>
-            <w:r>
-              <w:t>RF05</w:t>
-            </w:r>
-          </w:p>
-        </w:tc>
-        <w:tc>
-          <w:tcPr>
-            <w:tcW w:w="2127" w:type="dxa"/>
-          </w:tcPr>
-          <w:p>
-            <w:pPr>
-              <w:rPr>
-                <w:sz w:val="20"/>
-                <w:szCs w:val="20"/>
-              </w:rPr>
-            </w:pPr>
-            <w:r>
-              <w:rPr>
-                <w:sz w:val="20"/>
-                <w:szCs w:val="20"/>
-              </w:rPr>
-              <w:t>Atualização de dados do cliente</w:t>
-            </w:r>
-          </w:p>
-        </w:tc>
-        <w:tc>
-          <w:tcPr>
-            <w:tcW w:w="7654" w:type="dxa"/>
-          </w:tcPr>
-          <w:p>
-            <w:pPr>
-              <w:rPr>
-                <w:sz w:val="20"/>
-                <w:szCs w:val="20"/>
-              </w:rPr>
-            </w:pPr>
-            <w:r>
-              <w:rPr>
-                <w:sz w:val="20"/>
-                <w:szCs w:val="20"/>
-              </w:rPr>
-              <w:t xml:space="preserve">O sistema permite editar os dados de clientes já cadastrados. A gravação é </w:t>
-            </w:r>
-            <w:r>
-              <w:rPr>
-                <w:b/>
-                <w:bCs/>
-                <w:sz w:val="20"/>
-                <w:szCs w:val="20"/>
-              </w:rPr>
-              <w:t>atômica</w:t>
-            </w:r>
-            <w:r>
-              <w:rPr>
-                <w:sz w:val="20"/>
-                <w:szCs w:val="20"/>
-              </w:rPr>
-              <w:t xml:space="preserve">: se houver falha de rede ou do servidor, a operação sofre </w:t>
-            </w:r>
-            <w:proofErr w:type="spellStart"/>
-            <w:r>
-              <w:rPr>
-                <w:i/>
-                <w:iCs/>
-                <w:sz w:val="20"/>
-                <w:szCs w:val="20"/>
-              </w:rPr>
-              <w:t>rollback</w:t>
-            </w:r>
-            <w:proofErr w:type="spellEnd"/>
-            <w:r>
-              <w:rPr>
-                <w:sz w:val="20"/>
-                <w:szCs w:val="20"/>
-              </w:rPr>
-              <w:t>, o registro permanece íntegro e o sistema exibe “A alteração não foi salva. Verifique sua conexão”. A alteração bem-sucedida registra o usuário e o carimbo de data/hora da última modificação. As regras de unicidade do RF03 continuam valendo na edição.</w:t>
-            </w:r>
-          </w:p>
-        </w:tc>
-      </w:tr>
-      <w:tr>
-        <w:trPr>
-          <w:trHeight w:val="575"/>
-        </w:trPr>
-        <w:tc>
-          <w:tcPr>
-            <w:tcW w:w="851" w:type="dxa"/>
-          </w:tcPr>
-          <w:p>
-            <w:r>
-              <w:t>RF06</w:t>
-            </w:r>
-          </w:p>
-        </w:tc>
-        <w:tc>
-          <w:tcPr>
-            <w:tcW w:w="2127" w:type="dxa"/>
-          </w:tcPr>
-          <w:p>
-            <w:pPr>
-              <w:rPr>
-                <w:sz w:val="20"/>
-                <w:szCs w:val="20"/>
-              </w:rPr>
-            </w:pPr>
-            <w:r>
-              <w:rPr>
-                <w:sz w:val="20"/>
-                <w:szCs w:val="20"/>
-              </w:rPr>
-              <w:t>Criação de tarefas e lembretes</w:t>
-            </w:r>
-          </w:p>
-        </w:tc>
-        <w:tc>
-          <w:tcPr>
-            <w:tcW w:w="7654" w:type="dxa"/>
-          </w:tcPr>
-          <w:p>
-            <w:pPr>
-              <w:rPr>
-                <w:sz w:val="20"/>
-                <w:szCs w:val="20"/>
-              </w:rPr>
-            </w:pPr>
-            <w:r>
-              <w:rPr>
-                <w:sz w:val="20"/>
-                <w:szCs w:val="20"/>
-              </w:rPr>
-              <w:t>O sistema permite criar tarefas e lembretes com descrição, prazo limite e vínculo obrigatório a um cliente (chave estrangeira) e a um usuário responsável. Prazos anteriores à data corrente são rejeitados no servidor com a mensagem “Data inválida”, e o foco retorna ao campo. Ao salvar, a tarefa é agendada e associada ao histórico do cliente.</w:t>
-            </w:r>
-          </w:p>
-        </w:tc>
-      </w:tr>
-      <w:tr>
-        <w:trPr>
-          <w:trHeight w:val="575"/>
-        </w:trPr>
-        <w:tc>
-          <w:tcPr>
-            <w:tcW w:w="851" w:type="dxa"/>
-          </w:tcPr>
-          <w:p>
-            <w:r>
-              <w:t>RF07</w:t>
-            </w:r>
-          </w:p>
-        </w:tc>
-        <w:tc>
-          <w:tcPr>
-            <w:tcW w:w="2127" w:type="dxa"/>
-          </w:tcPr>
-          <w:p>
-            <w:pPr>
-              <w:rPr>
-                <w:sz w:val="20"/>
-                <w:szCs w:val="20"/>
-              </w:rPr>
-            </w:pPr>
-            <w:r>
-              <w:rPr>
-                <w:sz w:val="20"/>
-                <w:szCs w:val="20"/>
-              </w:rPr>
-              <w:t>Acompanhamento por fases do atendimento</w:t>
-            </w:r>
-          </w:p>
-        </w:tc>
-        <w:tc>
-          <w:tcPr>
-            <w:tcW w:w="7654" w:type="dxa"/>
-          </w:tcPr>
-          <w:p>
-            <w:pPr>
-              <w:rPr>
-                <w:sz w:val="20"/>
-                <w:szCs w:val="20"/>
-              </w:rPr>
-            </w:pPr>
-            <w:r>
-              <w:rPr>
-                <w:sz w:val="20"/>
-                <w:szCs w:val="20"/>
-              </w:rPr>
-              <w:t>O sistema exibe um painel de fluxo (</w:t>
-            </w:r>
-            <w:proofErr w:type="spellStart"/>
-            <w:r>
-              <w:rPr>
-                <w:sz w:val="20"/>
-                <w:szCs w:val="20"/>
-              </w:rPr>
-              <w:t>Kanban</w:t>
-            </w:r>
-            <w:proofErr w:type="spellEnd"/>
-            <w:r>
-              <w:rPr>
-                <w:sz w:val="20"/>
-                <w:szCs w:val="20"/>
-              </w:rPr>
-              <w:t>) que agrupa clientes e tarefas por fase do funil (ex.: Prospecção, Orçamento, Fechamento). O painel reflete o estado persistido, permite a mudança de fase de um item, e a mudança fica registrada no histórico do cliente.</w:t>
-            </w:r>
-          </w:p>
-        </w:tc>
-      </w:tr>
-      <w:tr>
-        <w:trPr>
-          <w:trHeight w:val="575"/>
-        </w:trPr>
-        <w:tc>
-          <w:tcPr>
-            <w:tcW w:w="851" w:type="dxa"/>
-          </w:tcPr>
-          <w:p>
-            <w:r>
-              <w:t>RF08</w:t>
-            </w:r>
-          </w:p>
-        </w:tc>
-        <w:tc>
-          <w:tcPr>
-            <w:tcW w:w="2127" w:type="dxa"/>
-          </w:tcPr>
-          <w:p>
-            <w:pPr>
-              <w:rPr>
-                <w:sz w:val="20"/>
-                <w:szCs w:val="20"/>
-              </w:rPr>
-            </w:pPr>
-            <w:r>
-              <w:rPr>
-                <w:sz w:val="20"/>
-                <w:szCs w:val="20"/>
-              </w:rPr>
-              <w:t>Notificação de prazos</w:t>
-            </w:r>
-          </w:p>
-        </w:tc>
-        <w:tc>
-          <w:tcPr>
-            <w:tcW w:w="7654" w:type="dxa"/>
-          </w:tcPr>
-          <w:p>
-            <w:pPr>
-              <w:rPr>
-                <w:sz w:val="20"/>
-                <w:szCs w:val="20"/>
-              </w:rPr>
-            </w:pPr>
-            <w:r>
-              <w:rPr>
-                <w:sz w:val="20"/>
-                <w:szCs w:val="20"/>
-              </w:rPr>
-              <w:t xml:space="preserve">No login bem-sucedido, o sistema consulta as tarefas do usuário com prazo vencido ou com vencimento no dia corrente e exibe um </w:t>
-            </w:r>
-            <w:r>
-              <w:rPr>
-                <w:i/>
-                <w:iCs/>
-                <w:sz w:val="20"/>
-                <w:szCs w:val="20"/>
-              </w:rPr>
-              <w:t>pop-up</w:t>
-            </w:r>
-            <w:r>
-              <w:rPr>
-                <w:sz w:val="20"/>
-                <w:szCs w:val="20"/>
-              </w:rPr>
-              <w:t xml:space="preserve"> modal com o resumo das pendências. Se não houver tarefas pendentes, a tela inicial carrega sem o </w:t>
-            </w:r>
-            <w:r>
-              <w:rPr>
-                <w:i/>
-                <w:iCs/>
-                <w:sz w:val="20"/>
-                <w:szCs w:val="20"/>
-              </w:rPr>
-              <w:t>pop-up</w:t>
-            </w:r>
-            <w:r>
-              <w:rPr>
-                <w:sz w:val="20"/>
-                <w:szCs w:val="20"/>
-              </w:rPr>
-              <w:t>.</w:t>
-            </w:r>
-          </w:p>
-        </w:tc>
-      </w:tr>
-      <w:tr>
-        <w:trPr>
-          <w:trHeight w:val="575"/>
-        </w:trPr>
-        <w:tc>
-          <w:tcPr>
-            <w:tcW w:w="851" w:type="dxa"/>
-          </w:tcPr>
-          <w:p>
-            <w:r>
-              <w:t>RF09</w:t>
-            </w:r>
-          </w:p>
-        </w:tc>
-        <w:tc>
-          <w:tcPr>
-            <w:tcW w:w="2127" w:type="dxa"/>
-          </w:tcPr>
-          <w:p>
-            <w:pPr>
-              <w:rPr>
-                <w:sz w:val="20"/>
-                <w:szCs w:val="20"/>
-              </w:rPr>
-            </w:pPr>
-            <w:r>
-              <w:rPr>
-                <w:sz w:val="20"/>
-                <w:szCs w:val="20"/>
-              </w:rPr>
-              <w:t>Análise de vendas</w:t>
-            </w:r>
-          </w:p>
-        </w:tc>
-        <w:tc>
-          <w:tcPr>
-            <w:tcW w:w="7654" w:type="dxa"/>
-          </w:tcPr>
-          <w:p>
-            <w:pPr>
-              <w:rPr>
-                <w:sz w:val="20"/>
-                <w:szCs w:val="20"/>
-              </w:rPr>
-            </w:pPr>
-            <w:r>
-              <w:rPr>
-                <w:sz w:val="20"/>
-                <w:szCs w:val="20"/>
-              </w:rPr>
-              <w:t xml:space="preserve">Disponível apenas ao perfil </w:t>
-            </w:r>
-            <w:r>
-              <w:rPr>
-                <w:b/>
-                <w:bCs/>
-                <w:sz w:val="20"/>
-                <w:szCs w:val="20"/>
-              </w:rPr>
-              <w:t>Gestor</w:t>
-            </w:r>
-            <w:r>
-              <w:rPr>
-                <w:sz w:val="20"/>
-                <w:szCs w:val="20"/>
-              </w:rPr>
-              <w:t>. O sistema agrega faturamento e comissões das vendas registradas no período selecionado e renderiza gráficos de pizza e de barras. Sem registros no período, exibe “Nenhuma venda localizada para este período” e mantém o painel zerado. Durante o processamento, exibe indicador de carregamento. O módulo é de visualização e não substitui a planilha financeira da agência (fora do escopo).</w:t>
-            </w:r>
-          </w:p>
-        </w:tc>
-      </w:tr>
-    </w:tbl>
-    <w:p/>
-    <w:tbl>
-      <w:tblPr>
-        <w:tblStyle w:val="Tabelacomgrade"/>
-        <w:tblW w:w="9923" w:type="dxa"/>
-        <w:tblInd w:w="-714" w:type="dxa"/>
-        <w:tblLook w:val="04A0" w:firstRow="1" w:lastRow="0" w:firstColumn="1" w:lastColumn="0" w:noHBand="0" w:noVBand="1"/>
-      </w:tblPr>
-      <w:tblGrid>
-        <w:gridCol w:w="1135"/>
-        <w:gridCol w:w="2268"/>
-        <w:gridCol w:w="6520"/>
-      </w:tblGrid>
-      <w:tr>
-        <w:trPr>
-          <w:trHeight w:val="406"/>
-        </w:trPr>
-        <w:tc>
-          <w:tcPr>
-            <w:tcW w:w="1135" w:type="dxa"/>
-          </w:tcPr>
-          <w:p>
-            <w:r>
-              <w:lastRenderedPageBreak/>
-              <w:t xml:space="preserve">  ID</w:t>
-            </w:r>
-          </w:p>
-        </w:tc>
-        <w:tc>
-          <w:tcPr>
-            <w:tcW w:w="2268" w:type="dxa"/>
-          </w:tcPr>
-          <w:p>
-            <w:r>
-              <w:t xml:space="preserve">  Categoria</w:t>
-            </w:r>
-          </w:p>
-        </w:tc>
-        <w:tc>
-          <w:tcPr>
-            <w:tcW w:w="6520" w:type="dxa"/>
-          </w:tcPr>
-          <w:p>
-            <w:r>
-              <w:t>Descrição Técnica</w:t>
-            </w:r>
-          </w:p>
-        </w:tc>
-      </w:tr>
-      <w:tr>
-        <w:trPr>
-          <w:trHeight w:val="420"/>
-        </w:trPr>
-        <w:tc>
-          <w:tcPr>
-            <w:tcW w:w="1135" w:type="dxa"/>
-          </w:tcPr>
-          <w:p>
-            <w:r>
-              <w:t>RNF01</w:t>
-            </w:r>
-          </w:p>
-        </w:tc>
-        <w:tc>
-          <w:tcPr>
-            <w:tcW w:w="2268" w:type="dxa"/>
-          </w:tcPr>
-          <w:p>
-            <w:r>
-              <w:t>Usabilidade</w:t>
-            </w:r>
-          </w:p>
-        </w:tc>
-        <w:tc>
-          <w:tcPr>
-            <w:tcW w:w="6520" w:type="dxa"/>
-          </w:tcPr>
-          <w:p>
-            <w:pPr>
-              <w:rPr>
-                <w:sz w:val="20"/>
-                <w:szCs w:val="20"/>
-              </w:rPr>
-            </w:pPr>
-            <w:r>
-              <w:rPr>
-                <w:sz w:val="20"/>
-                <w:szCs w:val="20"/>
-              </w:rPr>
-              <w:t xml:space="preserve">A interface segue padrões consistentes de navegação e de mensagens de erro. Em testes de usabilidade, um usuário sem treinamento conclui cadastro e login em até </w:t>
-            </w:r>
-            <w:r>
-              <w:rPr>
-                <w:b/>
-                <w:bCs/>
-                <w:sz w:val="20"/>
-                <w:szCs w:val="20"/>
-              </w:rPr>
-              <w:t>120 segundos</w:t>
-            </w:r>
-            <w:r>
-              <w:rPr>
-                <w:sz w:val="20"/>
-                <w:szCs w:val="20"/>
-              </w:rPr>
-              <w:t>, sem auxílio de suporte. Campos obrigatórios e erros de validação são indicados no próprio formulário.</w:t>
-            </w:r>
-          </w:p>
-        </w:tc>
-      </w:tr>
-      <w:tr>
-        <w:trPr>
-          <w:trHeight w:val="406"/>
-        </w:trPr>
-        <w:tc>
-          <w:tcPr>
-            <w:tcW w:w="1135" w:type="dxa"/>
-          </w:tcPr>
-          <w:p>
-            <w:r>
-              <w:t>RNF02</w:t>
-            </w:r>
-          </w:p>
-        </w:tc>
-        <w:tc>
-          <w:tcPr>
-            <w:tcW w:w="2268" w:type="dxa"/>
-          </w:tcPr>
-          <w:p>
-            <w:r>
-              <w:t>Desempenho</w:t>
-            </w:r>
-          </w:p>
-        </w:tc>
-        <w:tc>
-          <w:tcPr>
-            <w:tcW w:w="6520" w:type="dxa"/>
-          </w:tcPr>
-          <w:p>
-            <w:pPr>
-              <w:rPr>
-                <w:sz w:val="20"/>
-                <w:szCs w:val="20"/>
-              </w:rPr>
-            </w:pPr>
-            <w:r>
-              <w:rPr>
-                <w:sz w:val="20"/>
-                <w:szCs w:val="20"/>
-              </w:rPr>
-              <w:t xml:space="preserve">Consultas de clientes (RF04) e geração de gráficos (RF09) respondem em no máximo </w:t>
-            </w:r>
-            <w:r>
-              <w:rPr>
-                <w:b/>
-                <w:bCs/>
-                <w:sz w:val="20"/>
-                <w:szCs w:val="20"/>
-              </w:rPr>
-              <w:t>10 segundos</w:t>
-            </w:r>
-            <w:r>
-              <w:rPr>
-                <w:sz w:val="20"/>
-                <w:szCs w:val="20"/>
-              </w:rPr>
-              <w:t xml:space="preserve"> sob condições normais de rede. Os campos de busca (CPF, nome, destino) são indexados, e a interface exibe indicador de carregamento durante o processamento.</w:t>
-            </w:r>
-          </w:p>
-        </w:tc>
-      </w:tr>
-      <w:tr>
-        <w:trPr>
-          <w:trHeight w:val="406"/>
-        </w:trPr>
-        <w:tc>
-          <w:tcPr>
-            <w:tcW w:w="1135" w:type="dxa"/>
-          </w:tcPr>
-          <w:p>
-            <w:r>
-              <w:t>RNF03</w:t>
-            </w:r>
-          </w:p>
-        </w:tc>
-        <w:tc>
-          <w:tcPr>
-            <w:tcW w:w="2268" w:type="dxa"/>
-          </w:tcPr>
-          <w:p>
-            <w:r>
-              <w:t>Segurança</w:t>
-            </w:r>
-          </w:p>
-        </w:tc>
-        <w:tc>
-          <w:tcPr>
-            <w:tcW w:w="6520" w:type="dxa"/>
-          </w:tcPr>
-          <w:p>
-            <w:pPr>
-              <w:rPr>
-                <w:sz w:val="20"/>
-                <w:szCs w:val="20"/>
-              </w:rPr>
-            </w:pPr>
-            <w:r>
-              <w:rPr>
-                <w:sz w:val="20"/>
-                <w:szCs w:val="20"/>
-              </w:rPr>
-              <w:t xml:space="preserve">Todo o tráfego trafega por </w:t>
-            </w:r>
-            <w:r>
-              <w:rPr>
-                <w:b/>
-                <w:bCs/>
-                <w:sz w:val="20"/>
-                <w:szCs w:val="20"/>
-              </w:rPr>
-              <w:t>HTTPS (TLS 1.2 ou superior)</w:t>
-            </w:r>
-            <w:r>
-              <w:rPr>
-                <w:sz w:val="20"/>
-                <w:szCs w:val="20"/>
-              </w:rPr>
-              <w:t xml:space="preserve">. As senhas são armazenadas com </w:t>
-            </w:r>
-            <w:proofErr w:type="spellStart"/>
-            <w:r>
-              <w:rPr>
-                <w:sz w:val="20"/>
-                <w:szCs w:val="20"/>
-              </w:rPr>
-              <w:t>hash</w:t>
-            </w:r>
-            <w:proofErr w:type="spellEnd"/>
-            <w:r>
-              <w:rPr>
-                <w:sz w:val="20"/>
-                <w:szCs w:val="20"/>
-              </w:rPr>
-              <w:t xml:space="preserve"> adaptativo e </w:t>
-            </w:r>
-            <w:proofErr w:type="spellStart"/>
-            <w:r>
-              <w:rPr>
-                <w:i/>
-                <w:iCs/>
-                <w:sz w:val="20"/>
-                <w:szCs w:val="20"/>
-              </w:rPr>
-              <w:t>salt</w:t>
-            </w:r>
-            <w:proofErr w:type="spellEnd"/>
-            <w:r>
-              <w:rPr>
-                <w:sz w:val="20"/>
-                <w:szCs w:val="20"/>
-              </w:rPr>
-              <w:t xml:space="preserve"> (</w:t>
-            </w:r>
-            <w:proofErr w:type="spellStart"/>
-            <w:r>
-              <w:rPr>
-                <w:sz w:val="20"/>
-                <w:szCs w:val="20"/>
-              </w:rPr>
-              <w:t>bcrypt</w:t>
-            </w:r>
-            <w:proofErr w:type="spellEnd"/>
-            <w:r>
-              <w:rPr>
-                <w:sz w:val="20"/>
-                <w:szCs w:val="20"/>
-              </w:rPr>
-              <w:t xml:space="preserve"> ou Argon2), nunca em texto claro. A política de senha exige mínimo de 8 caracteres, com letras, números e caracteres especiais. As consultas ao banco usam instruções parametrizadas (prevenção de SQL </w:t>
-            </w:r>
-            <w:proofErr w:type="spellStart"/>
-            <w:r>
-              <w:rPr>
-                <w:i/>
-                <w:iCs/>
-                <w:sz w:val="20"/>
-                <w:szCs w:val="20"/>
-              </w:rPr>
-              <w:t>injection</w:t>
-            </w:r>
-            <w:proofErr w:type="spellEnd"/>
-            <w:r>
-              <w:rPr>
-                <w:sz w:val="20"/>
-                <w:szCs w:val="20"/>
-              </w:rPr>
-              <w:t>), e as saídas são sanitizadas (prevenção de XSS). A chave de acesso ao serviço de IA fica apenas no servidor, fora do código-fonte. O acesso a funcionalidades é restrito por perfil (RBAC). O tratamento de dados pessoais (CPF, contatos) observa a LGPD.</w:t>
-            </w:r>
-          </w:p>
-        </w:tc>
-      </w:tr>
-      <w:tr>
-        <w:trPr>
-          <w:trHeight w:val="406"/>
-        </w:trPr>
-        <w:tc>
-          <w:tcPr>
-            <w:tcW w:w="1135" w:type="dxa"/>
-          </w:tcPr>
-          <w:p>
-            <w:r>
-              <w:t>RNF04</w:t>
-            </w:r>
-          </w:p>
-        </w:tc>
-        <w:tc>
-          <w:tcPr>
-            <w:tcW w:w="2268" w:type="dxa"/>
-          </w:tcPr>
-          <w:p>
-            <w:r>
-              <w:t>Disponibilidade</w:t>
-            </w:r>
-          </w:p>
-        </w:tc>
-        <w:tc>
-          <w:tcPr>
-            <w:tcW w:w="6520" w:type="dxa"/>
-          </w:tcPr>
-          <w:p>
-            <w:pPr>
-              <w:rPr>
-                <w:sz w:val="20"/>
-                <w:szCs w:val="20"/>
-              </w:rPr>
-            </w:pPr>
-            <w:r>
-              <w:rPr>
-                <w:sz w:val="20"/>
-                <w:szCs w:val="20"/>
-              </w:rPr>
-              <w:t xml:space="preserve">O sistema opera 24 h por dia, com meta de </w:t>
-            </w:r>
-            <w:r>
-              <w:rPr>
-                <w:b/>
-                <w:bCs/>
-                <w:sz w:val="20"/>
-                <w:szCs w:val="20"/>
-              </w:rPr>
-              <w:t>99,5% de disponibilidade mensal</w:t>
-            </w:r>
-            <w:r>
-              <w:rPr>
-                <w:sz w:val="20"/>
-                <w:szCs w:val="20"/>
-              </w:rPr>
-              <w:t xml:space="preserve">, excluindo a janela de manutenção programada entre </w:t>
-            </w:r>
-            <w:r>
-              <w:rPr>
-                <w:b/>
-                <w:bCs/>
-                <w:sz w:val="20"/>
-                <w:szCs w:val="20"/>
-              </w:rPr>
-              <w:t>00:00 e 05:00 (horário de Brasília)</w:t>
-            </w:r>
-            <w:r>
-              <w:rPr>
-                <w:sz w:val="20"/>
-                <w:szCs w:val="20"/>
-              </w:rPr>
-              <w:t>, escolhida para não impactar o horário comercial.</w:t>
-            </w:r>
-          </w:p>
-        </w:tc>
-      </w:tr>
-      <w:tr>
-        <w:trPr>
-          <w:trHeight w:val="406"/>
-        </w:trPr>
-        <w:tc>
-          <w:tcPr>
-            <w:tcW w:w="1135" w:type="dxa"/>
-          </w:tcPr>
-          <w:p>
-            <w:r>
-              <w:t>RNF05</w:t>
-            </w:r>
-          </w:p>
-        </w:tc>
-        <w:tc>
-          <w:tcPr>
-            <w:tcW w:w="2268" w:type="dxa"/>
-          </w:tcPr>
-          <w:p>
-            <w:r>
-              <w:t>Compatibilidade</w:t>
-            </w:r>
-          </w:p>
-        </w:tc>
-        <w:tc>
-          <w:tcPr>
-            <w:tcW w:w="6520" w:type="dxa"/>
-          </w:tcPr>
-          <w:p>
-            <w:pPr>
-              <w:rPr>
-                <w:sz w:val="20"/>
-                <w:szCs w:val="20"/>
-              </w:rPr>
-            </w:pPr>
-            <w:r>
-              <w:rPr>
-                <w:sz w:val="20"/>
-                <w:szCs w:val="20"/>
-              </w:rPr>
-              <w:t>A interface é responsiva (</w:t>
-            </w:r>
-            <w:r>
-              <w:rPr>
-                <w:i/>
-                <w:iCs/>
-                <w:sz w:val="20"/>
-                <w:szCs w:val="20"/>
-              </w:rPr>
-              <w:t>layout</w:t>
-            </w:r>
-            <w:r>
-              <w:rPr>
-                <w:sz w:val="20"/>
-                <w:szCs w:val="20"/>
-              </w:rPr>
-              <w:t xml:space="preserve"> fluido, com pontos de quebra para desktop, tablet e smartphone) e funciona nas versões atuais de Chrome, Firefox e Edge.</w:t>
-            </w:r>
-          </w:p>
-        </w:tc>
-      </w:tr>
-      <w:tr>
-        <w:trPr>
-          <w:trHeight w:val="420"/>
-        </w:trPr>
-        <w:tc>
-          <w:tcPr>
-            <w:tcW w:w="1135" w:type="dxa"/>
-          </w:tcPr>
-          <w:p>
-            <w:r>
-              <w:t>RNF06</w:t>
-            </w:r>
-          </w:p>
-        </w:tc>
-        <w:tc>
-          <w:tcPr>
-            <w:tcW w:w="2268" w:type="dxa"/>
-          </w:tcPr>
-          <w:p>
-            <w:r>
-              <w:t>Manutenibilidade</w:t>
-            </w:r>
-          </w:p>
-        </w:tc>
-        <w:tc>
-          <w:tcPr>
-            <w:tcW w:w="6520" w:type="dxa"/>
-          </w:tcPr>
-          <w:p>
-            <w:pPr>
-              <w:rPr>
-                <w:sz w:val="20"/>
-                <w:szCs w:val="20"/>
-              </w:rPr>
-            </w:pPr>
-            <w:r>
-              <w:rPr>
-                <w:sz w:val="20"/>
-                <w:szCs w:val="20"/>
-              </w:rPr>
-              <w:t xml:space="preserve">O código é organizado em camadas e módulos de baixo acoplamento (apresentação, regras de negócio e acesso a dados), sob controle de versão e com padrão de codificação verificado por </w:t>
-            </w:r>
-            <w:proofErr w:type="spellStart"/>
-            <w:r>
-              <w:rPr>
-                <w:i/>
-                <w:iCs/>
-                <w:sz w:val="20"/>
-                <w:szCs w:val="20"/>
-              </w:rPr>
-              <w:t>linter</w:t>
-            </w:r>
-            <w:proofErr w:type="spellEnd"/>
-            <w:r>
-              <w:rPr>
-                <w:sz w:val="20"/>
-                <w:szCs w:val="20"/>
-              </w:rPr>
-              <w:t xml:space="preserve">. A suíte de testes automatizados mantém cobertura mínima de </w:t>
-            </w:r>
-            <w:r>
-              <w:rPr>
-                <w:b/>
-                <w:bCs/>
-                <w:sz w:val="20"/>
-                <w:szCs w:val="20"/>
-              </w:rPr>
-              <w:t>70%</w:t>
-            </w:r>
-            <w:r>
-              <w:rPr>
-                <w:sz w:val="20"/>
-                <w:szCs w:val="20"/>
-              </w:rPr>
-              <w:t>, e novas funcionalidades são adicionadas sem alterar o comportamento dos módulos existentes.</w:t>
-            </w:r>
-          </w:p>
-        </w:tc>
-      </w:tr>
-    </w:tbl>
-    <w:p/>
-    <w:p/>
-    <w:p>
-      <w:r>
-        <w:t>SGBD</w:t>
-      </w:r>
-    </w:p>
-    <w:p/>
     <w:p>
       <w:pPr>
         <w:rPr>
@@ -1536,7 +260,6 @@
           </w:tcPr>
           <w:p>
             <w:r>
-              <w:lastRenderedPageBreak/>
               <w:t>Vendas, faturamento e comissões</w:t>
             </w:r>
           </w:p>
@@ -2225,6 +948,7 @@
           </w:tcPr>
           <w:p>
             <w:r>
+              <w:lastRenderedPageBreak/>
               <w:t>Alteração ou exclusão sem rastro</w:t>
             </w:r>
           </w:p>
@@ -2379,7 +1103,6 @@
         </w:numPr>
       </w:pPr>
       <w:r>
-        <w:lastRenderedPageBreak/>
         <w:t xml:space="preserve">Contas separadas por função: </w:t>
       </w:r>
       <w:proofErr w:type="spellStart"/>
@@ -2846,6 +1569,7 @@
     <w:p/>
     <w:p>
       <w:r>
+        <w:lastRenderedPageBreak/>
         <w:t>E</w:t>
       </w:r>
       <w:r>
@@ -2967,7 +1691,6 @@
           <w:b/>
           <w:bCs/>
         </w:rPr>
-        <w:lastRenderedPageBreak/>
         <w:t>Em repouso:</w:t>
       </w:r>
       <w:r>
@@ -3167,6 +1890,7 @@
           <w:b/>
           <w:bCs/>
         </w:rPr>
+        <w:lastRenderedPageBreak/>
         <w:t>Opcional:</w:t>
       </w:r>
       <w:r>
@@ -3254,7 +1978,6 @@
           <w:b/>
           <w:bCs/>
         </w:rPr>
-        <w:lastRenderedPageBreak/>
         <w:t>Retenção:</w:t>
       </w:r>
       <w:r>
@@ -3517,7 +2240,7 @@
 </file>
 
 <file path=word/numbering.xml><?xml version="1.0" encoding="utf-8"?>
-<w:numbering xmlns:wpc="http://schemas.microsoft.com/office/word/2010/wordprocessingCanvas" xmlns:cx="http://schemas.microsoft.com/office/drawing/2014/chartex" xmlns:cx1="http://schemas.microsoft.com/office/drawing/2015/9/8/chartex" xmlns:cx2="http://schemas.microsoft.com/office/drawing/2015/10/21/chartex" xmlns:cx3="http://schemas.microsoft.com/office/drawing/2016/5/9/chartex" xmlns:cx4="http://schemas.microsoft.com/office/drawing/2016/5/10/chartex" xmlns:cx5="http://schemas.microsoft.com/office/drawing/2016/5/11/chartex" xmlns:cx6="http://schemas.microsoft.com/office/drawing/2016/5/12/chartex" xmlns:cx7="http://schemas.microsoft.com/office/drawing/2016/5/13/chartex" xmlns:cx8="http://schemas.microsoft.com/office/drawing/2016/5/14/chartex" xmlns:mc="http://schemas.openxmlformats.org/markup-compatibility/2006" xmlns:aink="http://schemas.microsoft.com/office/drawing/2016/ink" xmlns:am3d="http://schemas.microsoft.com/office/drawing/2017/model3d" xmlns:o="urn:schemas-microsoft-com:office:office" xmlns:oel="http://schemas.microsoft.com/office/2019/extlst" xmlns:r="http://schemas.openxmlformats.org/officeDocument/2006/relationships" xmlns:m="http://schemas.openxmlformats.org/officeDocument/2006/math" xmlns:v="urn:schemas-microsoft-com:vml" xmlns:wp14="http://schemas.microsoft.com/office/word/2010/wordprocessingDrawing" xmlns:wp="http://schemas.openxmlformats.org/drawingml/2006/wordprocessingDrawing" xmlns:w10="urn:schemas-microsoft-com:office:word" xmlns:w="http://schemas.openxmlformats.org/wordprocessingml/2006/main" xmlns:w14="http://schemas.microsoft.com/office/word/2010/wordml" xmlns:w15="http://schemas.microsoft.com/office/word/2012/wordml" xmlns:w16cex="http://schemas.microsoft.com/office/word/2018/wordml/cex" xmlns:w16cid="http://schemas.microsoft.com/office/word/2016/wordml/cid" xmlns:w16="http://schemas.microsoft.com/office/word/2018/wordml" xmlns:w16du="http://schemas.microsoft.com/office/word/2023/wordml/word16du" xmlns:w16sdtdh="http://schemas.microsoft.com/office/word/2020/wordml/sdtdatahash" xmlns:w16sdtfl="http://schemas.microsoft.com/office/word/2024/wordml/sdtformatlock" xmlns:w16se="http://schemas.microsoft.com/office/word/2015/wordml/symex" xmlns:wpg="http://schemas.microsoft.com/office/word/2010/wordprocessingGroup" xmlns:wpi="http://schemas.microsoft.com/office/word/2010/wordprocessingInk" xmlns:wne="http://schemas.microsoft.com/office/word/2006/wordml" xmlns:wps="http://schemas.microsoft.com/office/word/2010/wordprocessingShape" mc:Ignorable="w14 w15 w16se w16cid w16 w16cex w16sdtdh w16sdtfl w16du wp14">
+<w:numbering xmlns:wpc="http://schemas.microsoft.com/office/word/2010/wordprocessingCanvas" xmlns:cx="http://schemas.microsoft.com/office/drawing/2014/chartex" xmlns:cx1="http://schemas.microsoft.com/office/drawing/2015/9/8/chartex" xmlns:cx2="http://schemas.microsoft.com/office/drawing/2015/10/21/chartex" xmlns:cx3="http://schemas.microsoft.com/office/drawing/2016/5/9/chartex" xmlns:cx4="http://schemas.microsoft.com/office/drawing/2016/5/10/chartex" xmlns:cx5="http://schemas.microsoft.com/office/drawing/2016/5/11/chartex" xmlns:cx6="http://schemas.microsoft.com/office/drawing/2016/5/12/chartex" xmlns:cx7="http://schemas.microsoft.com/office/drawing/2016/5/13/chartex" xmlns:cx8="http://schemas.microsoft.com/office/drawing/2016/5/14/chartex" xmlns:mc="http://schemas.openxmlformats.org/markup-compatibility/2006" xmlns:aink="http://schemas.microsoft.com/office/drawing/2016/ink" xmlns:am3d="http://schemas.microsoft.com/office/drawing/2017/model3d" xmlns:o="urn:schemas-microsoft-com:office:office" xmlns:oel="http://schemas.microsoft.com/office/2019/extlst" xmlns:r="http://schemas.openxmlformats.org/officeDocument/2006/relationships" xmlns:m="http://schemas.openxmlformats.org/officeDocument/2006/math" xmlns:v="urn:schemas-microsoft-com:vml" xmlns:wp14="http://schemas.microsoft.com/office/word/2010/wordprocessingDrawing" xmlns:wp="http://schemas.openxmlformats.org/drawingml/2006/wordprocessingDrawing" xmlns:w10="urn:schemas-microsoft-com:office:word" xmlns:w="http://schemas.openxmlformats.org/wordprocessingml/2006/main" xmlns:w14="http://schemas.microsoft.com/office/word/2010/wordml" xmlns:w15="http://schemas.microsoft.com/office/word/2012/wordml" xmlns:w16cex="http://schemas.microsoft.com/office/word/2018/wordml/cex" xmlns:w16cid="http://schemas.microsoft.com/office/word/2016/wordml/cid" xmlns:w16="http://schemas.microsoft.com/office/word/2018/wordml" xmlns:w16sdtdh="http://schemas.microsoft.com/office/word/2020/wordml/sdtdatahash" xmlns:w16se="http://schemas.microsoft.com/office/word/2015/wordml/symex" xmlns:wpg="http://schemas.microsoft.com/office/word/2010/wordprocessingGroup" xmlns:wpi="http://schemas.microsoft.com/office/word/2010/wordprocessingInk" xmlns:wne="http://schemas.microsoft.com/office/word/2006/wordml" xmlns:wps="http://schemas.microsoft.com/office/word/2010/wordprocessingShape" mc:Ignorable="w14 w15 w16se w16cid w16 w16cex w16sdtdh wp14">
   <w:abstractNum w:abstractNumId="0" w15:restartNumberingAfterBreak="0">
     <w:nsid w:val="1DFA27B2"/>
     <w:multiLevelType w:val="multilevel"/>
@@ -4398,7 +3121,7 @@
 </file>
 
 <file path=word/styles.xml><?xml version="1.0" encoding="utf-8"?>
-<w:styles xmlns:mc="http://schemas.openxmlformats.org/markup-compatibility/2006" xmlns:r="http://schemas.openxmlformats.org/officeDocument/2006/relationships" xmlns:w="http://schemas.openxmlformats.org/wordprocessingml/2006/main" xmlns:w14="http://schemas.microsoft.com/office/word/2010/wordml" xmlns:w15="http://schemas.microsoft.com/office/word/2012/wordml" xmlns:w16cex="http://schemas.microsoft.com/office/word/2018/wordml/cex" xmlns:w16cid="http://schemas.microsoft.com/office/word/2016/wordml/cid" xmlns:w16="http://schemas.microsoft.com/office/word/2018/wordml" xmlns:w16du="http://schemas.microsoft.com/office/word/2023/wordml/word16du" xmlns:w16sdtdh="http://schemas.microsoft.com/office/word/2020/wordml/sdtdatahash" xmlns:w16sdtfl="http://schemas.microsoft.com/office/word/2024/wordml/sdtformatlock" xmlns:w16se="http://schemas.microsoft.com/office/word/2015/wordml/symex" mc:Ignorable="w14 w15 w16se w16cid w16 w16cex w16sdtdh w16sdtfl w16du">
+<w:styles xmlns:mc="http://schemas.openxmlformats.org/markup-compatibility/2006" xmlns:r="http://schemas.openxmlformats.org/officeDocument/2006/relationships" xmlns:w="http://schemas.openxmlformats.org/wordprocessingml/2006/main" xmlns:w14="http://schemas.microsoft.com/office/word/2010/wordml" xmlns:w15="http://schemas.microsoft.com/office/word/2012/wordml" xmlns:w16cex="http://schemas.microsoft.com/office/word/2018/wordml/cex" xmlns:w16cid="http://schemas.microsoft.com/office/word/2016/wordml/cid" xmlns:w16="http://schemas.microsoft.com/office/word/2018/wordml" xmlns:w16sdtdh="http://schemas.microsoft.com/office/word/2020/wordml/sdtdatahash" xmlns:w16se="http://schemas.microsoft.com/office/word/2015/wordml/symex" mc:Ignorable="w14 w15 w16se w16cid w16 w16cex w16sdtdh">
   <w:docDefaults>
     <w:rPrDefault>
       <w:rPr>
@@ -5000,6 +3723,7 @@
   <w:style w:type="character" w:default="1" w:styleId="Fontepargpadro">
     <w:name w:val="Default Paragraph Font"/>
     <w:uiPriority w:val="1"/>
+    <w:semiHidden/>
     <w:unhideWhenUsed/>
   </w:style>
   <w:style w:type="table" w:default="1" w:styleId="Tabelanormal">

</xml_diff>